<commit_message>
Final modification for JOP
</commit_message>
<xml_diff>
--- a/Submissions/2.JOP/JOP Cover Letter.docx
+++ b/Submissions/2.JOP/JOP Cover Letter.docx
@@ -101,7 +101,7 @@
         <w:rPr>
           <w:rFonts w:ascii="Times New Roman" w:hAnsi="Times New Roman" w:cs="Times New Roman"/>
         </w:rPr>
-        <w:t>April 16</w:t>
+        <w:t>May 1</w:t>
       </w:r>
       <w:r>
         <w:rPr>
@@ -146,7 +146,7 @@
         <w:rPr>
           <w:rFonts w:ascii="Times New Roman" w:hAnsi="Times New Roman" w:cs="Times New Roman"/>
         </w:rPr>
-        <w:t>Gerring, Nalepa</w:t>
+        <w:t>Hellwig</w:t>
       </w:r>
       <w:r>
         <w:rPr>
@@ -158,8 +158,27 @@
         <w:rPr>
           <w:rFonts w:ascii="Times New Roman" w:hAnsi="Times New Roman" w:cs="Times New Roman"/>
         </w:rPr>
+        <w:t>Nokken</w:t>
+      </w:r>
+      <w:r>
+        <w:rPr>
+          <w:rFonts w:ascii="Times New Roman" w:hAnsi="Times New Roman" w:cs="Times New Roman"/>
+        </w:rPr>
+        <w:t xml:space="preserve">, </w:t>
+      </w:r>
+      <w:r>
+        <w:rPr>
+          <w:rFonts w:ascii="Times New Roman" w:hAnsi="Times New Roman" w:cs="Times New Roman"/>
+        </w:rPr>
         <w:t>and the Editorial Board,</w:t>
       </w:r>
+    </w:p>
+    <w:p>
+      <w:pPr>
+        <w:rPr>
+          <w:rFonts w:ascii="Times New Roman" w:hAnsi="Times New Roman" w:cs="Times New Roman"/>
+        </w:rPr>
+      </w:pPr>
     </w:p>
     <w:p>
       <w:pPr>
@@ -200,7 +219,7 @@
           <w:i/>
           <w:iCs/>
         </w:rPr>
-        <w:t>American Political Science Review</w:t>
+        <w:t>The Journal of Politics</w:t>
       </w:r>
       <w:r>
         <w:rPr>
@@ -231,7 +250,7 @@
         <w:rPr>
           <w:color w:val="0E101A"/>
         </w:rPr>
-        <w:t>In this paper, we introduce a new country-month dataset tracking reports of Russian and Chinese influence activity across 66 aid-receiving low- and middle-income countries from 2012 through August 2025. We construct this dataset by applying large language models to an original corpus of more than 120 million news articles drawn from high-quality domestic news sources. The absence of systematic quantitative data has long constrained scholarly investigation of authoritarian foreign influence, and this dataset addresses that gap directly. We use the data to document trends in influence activity over time and across countries, and as a test case we examine Russian influence activity in the months preceding the invasion of Ukraine. Our analysis uncovers a dramatic and previously undetected pre-invasion surge in diplomacy and hard power reporting across a wide range of countries. We argue that this dataset is valuable both for theory testing and for informing foreign policy decision-making at a moment when policymakers are increasingly attentive to the revival of superpower competition.</w:t>
+        <w:t>In this paper, we introduce a new country-month dataset tracking reports of Russian and Chinese influence activity across 66 low- and middle-income countries from 2012 through August 2025. We construct this dataset by applying large language models to an original corpus of more than 120 million news articles drawn from high-quality domestic news sources. The absence of systematic quantitative data has long constrained scholarly investigation of authoritarian foreign influence, and this dataset addresses that gap directly. We use the data to document trends in influence activity over time and across countries, and as a test case we examine Russian influence activity in the months preceding the invasion of Ukraine. Our analysis uncovers a dramatic and previously undetected pre-invasion surge in diplomacy and hard power reporting across a wide range of countries. We argue that this dataset is valuable both for theory testing and for informing foreign policy decision-making at a moment when policymakers are increasingly attentive to the revival of superpower competition.</w:t>
       </w:r>
       <w:r>
         <w:rPr>

</xml_diff>